<commit_message>
2 new resumes added with diff projects
</commit_message>
<xml_diff>
--- a/RESUME/Rithwik_Resume_ELCS.docx
+++ b/RESUME/Rithwik_Resume_ELCS.docx
@@ -1,6 +1,6 @@
 
 <file path=word/document.xml><?xml version="1.0" encoding="utf-8"?>
-<w:document xmlns:wpc="http://schemas.microsoft.com/office/word/2010/wordprocessingCanvas" xmlns:cx="http://schemas.microsoft.com/office/drawing/2014/chartex" xmlns:cx1="http://schemas.microsoft.com/office/drawing/2015/9/8/chartex" xmlns:cx2="http://schemas.microsoft.com/office/drawing/2015/10/21/chartex" xmlns:cx3="http://schemas.microsoft.com/office/drawing/2016/5/9/chartex" xmlns:cx4="http://schemas.microsoft.com/office/drawing/2016/5/10/chartex" xmlns:cx5="http://schemas.microsoft.com/office/drawing/2016/5/11/chartex" xmlns:cx6="http://schemas.microsoft.com/office/drawing/2016/5/12/chartex" xmlns:cx7="http://schemas.microsoft.com/office/drawing/2016/5/13/chartex" xmlns:cx8="http://schemas.microsoft.com/office/drawing/2016/5/14/chartex" xmlns:mc="http://schemas.openxmlformats.org/markup-compatibility/2006" xmlns:aink="http://schemas.microsoft.com/office/drawing/2016/ink" xmlns:am3d="http://schemas.microsoft.com/office/drawing/2017/model3d" xmlns:o="urn:schemas-microsoft-com:office:office" xmlns:oel="http://schemas.microsoft.com/office/2019/extlst" xmlns:r="http://schemas.openxmlformats.org/officeDocument/2006/relationships" xmlns:m="http://schemas.openxmlformats.org/officeDocument/2006/math" xmlns:v="urn:schemas-microsoft-com:vml" xmlns:wp14="http://schemas.microsoft.com/office/word/2010/wordprocessingDrawing" xmlns:wp="http://schemas.openxmlformats.org/drawingml/2006/wordprocessingDrawing" xmlns:w10="urn:schemas-microsoft-com:office:word" xmlns:w="http://schemas.openxmlformats.org/wordprocessingml/2006/main" xmlns:w14="http://schemas.microsoft.com/office/word/2010/wordml" xmlns:w15="http://schemas.microsoft.com/office/word/2012/wordml" xmlns:w16cei="http://schemas.microsoft.com/office/word/2026/wordml/cei" xmlns:w16cex="http://schemas.microsoft.com/office/word/2018/wordml/cex" xmlns:w16cid="http://schemas.microsoft.com/office/word/2016/wordml/cid" xmlns:w16="http://schemas.microsoft.com/office/word/2018/wordml" xmlns:w16du="http://schemas.microsoft.com/office/word/2023/wordml/word16du" xmlns:w16sdtdh="http://schemas.microsoft.com/office/word/2020/wordml/sdtdatahash" xmlns:w16sdtfl="http://schemas.microsoft.com/office/word/2024/wordml/sdtformatlock" xmlns:w16se="http://schemas.microsoft.com/office/word/2015/wordml/symex" xmlns:wpg="http://schemas.microsoft.com/office/word/2010/wordprocessingGroup" xmlns:wpi="http://schemas.microsoft.com/office/word/2010/wordprocessingInk" xmlns:wne="http://schemas.microsoft.com/office/word/2006/wordml" xmlns:wps="http://schemas.microsoft.com/office/word/2010/wordprocessingShape" mc:Ignorable="w14 w15 w16se w16cid w16 w16cex w16sdtdh w16sdtfl w16du wp14">
+<w:document xmlns:wpc="http://schemas.microsoft.com/office/word/2010/wordprocessingCanvas" xmlns:cx="http://schemas.microsoft.com/office/drawing/2014/chartex" xmlns:cx1="http://schemas.microsoft.com/office/drawing/2015/9/8/chartex" xmlns:cx2="http://schemas.microsoft.com/office/drawing/2015/10/21/chartex" xmlns:cx3="http://schemas.microsoft.com/office/drawing/2016/5/9/chartex" xmlns:cx4="http://schemas.microsoft.com/office/drawing/2016/5/10/chartex" xmlns:cx5="http://schemas.microsoft.com/office/drawing/2016/5/11/chartex" xmlns:cx6="http://schemas.microsoft.com/office/drawing/2016/5/12/chartex" xmlns:cx7="http://schemas.microsoft.com/office/drawing/2016/5/13/chartex" xmlns:cx8="http://schemas.microsoft.com/office/drawing/2016/5/14/chartex" xmlns:mc="http://schemas.openxmlformats.org/markup-compatibility/2006" xmlns:aink="http://schemas.microsoft.com/office/drawing/2016/ink" xmlns:am3d="http://schemas.microsoft.com/office/drawing/2017/model3d" xmlns:o="urn:schemas-microsoft-com:office:office" xmlns:oel="http://schemas.microsoft.com/office/2019/extlst" xmlns:r="http://schemas.openxmlformats.org/officeDocument/2006/relationships" xmlns:m="http://schemas.openxmlformats.org/officeDocument/2006/math" xmlns:v="urn:schemas-microsoft-com:vml" xmlns:wp14="http://schemas.microsoft.com/office/word/2010/wordprocessingDrawing" xmlns:wp="http://schemas.openxmlformats.org/drawingml/2006/wordprocessingDrawing" xmlns:w10="urn:schemas-microsoft-com:office:word" xmlns:w="http://schemas.openxmlformats.org/wordprocessingml/2006/main" xmlns:w14="http://schemas.microsoft.com/office/word/2010/wordml" xmlns:w15="http://schemas.microsoft.com/office/word/2012/wordml" xmlns:w16cex="http://schemas.microsoft.com/office/word/2018/wordml/cex" xmlns:w16cid="http://schemas.microsoft.com/office/word/2016/wordml/cid" xmlns:w16="http://schemas.microsoft.com/office/word/2018/wordml" xmlns:w16du="http://schemas.microsoft.com/office/word/2023/wordml/word16du" xmlns:w16sdtdh="http://schemas.microsoft.com/office/word/2020/wordml/sdtdatahash" xmlns:w16sdtfl="http://schemas.microsoft.com/office/word/2024/wordml/sdtformatlock" xmlns:w16se="http://schemas.microsoft.com/office/word/2015/wordml/symex" xmlns:wpg="http://schemas.microsoft.com/office/word/2010/wordprocessingGroup" xmlns:wpi="http://schemas.microsoft.com/office/word/2010/wordprocessingInk" xmlns:wne="http://schemas.microsoft.com/office/word/2006/wordml" xmlns:wps="http://schemas.microsoft.com/office/word/2010/wordprocessingShape" mc:Ignorable="w14 w15 w16se w16cid w16 w16cex w16sdtdh w16sdtfl w16du wp14">
   <w:body>
     <w:tbl>
       <w:tblPr>
@@ -2353,8 +2353,8 @@
         <w:tabs>
           <w:tab w:val="left" w:pos="544"/>
         </w:tabs>
-        <w:spacing w:before="243"/>
-        <w:ind w:right="398"/>
+        <w:spacing w:before="1"/>
+        <w:ind w:right="394"/>
         <w:jc w:val="both"/>
         <w:rPr>
           <w:sz w:val="24"/>
@@ -2364,25 +2364,81 @@
       <w:r>
         <w:rPr>
           <w:b/>
-          <w:sz w:val="24"/>
-          <w:szCs w:val="24"/>
-        </w:rPr>
-        <w:t>Habit Tracker</w:t>
-      </w:r>
-      <w:r>
-        <w:rPr>
-          <w:b/>
-          <w:sz w:val="24"/>
-          <w:szCs w:val="24"/>
-        </w:rPr>
-        <w:t xml:space="preserve">: </w:t>
-      </w:r>
-      <w:r>
-        <w:rPr>
-          <w:sz w:val="24"/>
-          <w:szCs w:val="24"/>
-        </w:rPr>
-        <w:t>Full-stack application for tracking habits, streaks, and recurring schedules using React.js, Node.js, Express.js, and MongoDB.</w:t>
+          <w:bCs/>
+          <w:sz w:val="24"/>
+          <w:szCs w:val="24"/>
+        </w:rPr>
+        <w:t>Distill – AI News Digest:</w:t>
+      </w:r>
+      <w:r>
+        <w:rPr>
+          <w:b/>
+          <w:sz w:val="24"/>
+          <w:szCs w:val="24"/>
+        </w:rPr>
+        <w:t xml:space="preserve"> </w:t>
+      </w:r>
+      <w:r>
+        <w:rPr>
+          <w:bCs/>
+          <w:sz w:val="24"/>
+          <w:szCs w:val="24"/>
+        </w:rPr>
+        <w:t xml:space="preserve">Daily AI-news digest on Telegram with </w:t>
+      </w:r>
+      <w:proofErr w:type="spellStart"/>
+      <w:r>
+        <w:rPr>
+          <w:bCs/>
+          <w:sz w:val="24"/>
+          <w:szCs w:val="24"/>
+        </w:rPr>
+        <w:t>MiniLM</w:t>
+      </w:r>
+      <w:proofErr w:type="spellEnd"/>
+      <w:r>
+        <w:rPr>
+          <w:bCs/>
+          <w:sz w:val="24"/>
+          <w:szCs w:val="24"/>
+        </w:rPr>
+        <w:t xml:space="preserve"> embedding </w:t>
+      </w:r>
+      <w:proofErr w:type="spellStart"/>
+      <w:r>
+        <w:rPr>
+          <w:bCs/>
+          <w:sz w:val="24"/>
+          <w:szCs w:val="24"/>
+        </w:rPr>
+        <w:t>dedup</w:t>
+      </w:r>
+      <w:proofErr w:type="spellEnd"/>
+      <w:r>
+        <w:rPr>
+          <w:bCs/>
+          <w:sz w:val="24"/>
+          <w:szCs w:val="24"/>
+        </w:rPr>
+        <w:t xml:space="preserve"> and </w:t>
+      </w:r>
+      <w:proofErr w:type="spellStart"/>
+      <w:r>
+        <w:rPr>
+          <w:bCs/>
+          <w:sz w:val="24"/>
+          <w:szCs w:val="24"/>
+        </w:rPr>
+        <w:t>Groq</w:t>
+      </w:r>
+      <w:proofErr w:type="spellEnd"/>
+      <w:r>
+        <w:rPr>
+          <w:bCs/>
+          <w:sz w:val="24"/>
+          <w:szCs w:val="24"/>
+        </w:rPr>
+        <w:t xml:space="preserve"> LLM summaries using Node.js, Vercel.</w:t>
       </w:r>
     </w:p>
     <w:p>
@@ -2406,32 +2462,27 @@
       <w:r>
         <w:rPr>
           <w:b/>
-          <w:sz w:val="24"/>
-          <w:szCs w:val="24"/>
-        </w:rPr>
-        <w:t>Library Management System</w:t>
-      </w:r>
-      <w:r>
-        <w:rPr>
-          <w:b/>
-          <w:sz w:val="24"/>
-          <w:szCs w:val="24"/>
-        </w:rPr>
-        <w:t xml:space="preserve">: </w:t>
-      </w:r>
-      <w:r>
-        <w:rPr>
-          <w:sz w:val="24"/>
-          <w:szCs w:val="24"/>
-        </w:rPr>
-        <w:t>Role-based system with JWT authentication, book transactions, automated fine calculation, and notifications using Node.js, Express.js, and MongoDB</w:t>
-      </w:r>
-      <w:r>
-        <w:rPr>
-          <w:sz w:val="24"/>
-          <w:szCs w:val="24"/>
-        </w:rPr>
-        <w:t>.</w:t>
+          <w:bCs/>
+          <w:sz w:val="24"/>
+          <w:szCs w:val="24"/>
+        </w:rPr>
+        <w:t>Habit Tracker:</w:t>
+      </w:r>
+      <w:r>
+        <w:rPr>
+          <w:b/>
+          <w:sz w:val="24"/>
+          <w:szCs w:val="24"/>
+        </w:rPr>
+        <w:t xml:space="preserve"> </w:t>
+      </w:r>
+      <w:r>
+        <w:rPr>
+          <w:bCs/>
+          <w:sz w:val="24"/>
+          <w:szCs w:val="24"/>
+        </w:rPr>
+        <w:t>Installable PWA with skip-aware streak scoring, push reminders, offline support using React.js, Express.js, MongoDB.</w:t>
       </w:r>
     </w:p>
     <w:p>
@@ -2455,6 +2506,41 @@
       <w:r>
         <w:rPr>
           <w:b/>
+          <w:bCs/>
+          <w:sz w:val="24"/>
+          <w:szCs w:val="24"/>
+        </w:rPr>
+        <w:t>Library Management System:</w:t>
+      </w:r>
+      <w:r>
+        <w:rPr>
+          <w:sz w:val="24"/>
+          <w:szCs w:val="24"/>
+        </w:rPr>
+        <w:t xml:space="preserve"> Role-based system with JWT authentication, per-copy availability, automated fines, Web Push alerts using Node.js, Express.js, MongoDB.</w:t>
+      </w:r>
+    </w:p>
+    <w:p>
+      <w:pPr>
+        <w:pStyle w:val="ListParagraph"/>
+        <w:numPr>
+          <w:ilvl w:val="0"/>
+          <w:numId w:val="2"/>
+        </w:numPr>
+        <w:tabs>
+          <w:tab w:val="left" w:pos="544"/>
+        </w:tabs>
+        <w:spacing w:before="1"/>
+        <w:ind w:right="394"/>
+        <w:jc w:val="both"/>
+        <w:rPr>
+          <w:sz w:val="24"/>
+          <w:szCs w:val="24"/>
+        </w:rPr>
+      </w:pPr>
+      <w:r>
+        <w:rPr>
+          <w:b/>
           <w:sz w:val="24"/>
           <w:szCs w:val="24"/>
         </w:rPr>
@@ -2562,95 +2648,6 @@
           <w:szCs w:val="24"/>
         </w:rPr>
         <w:t>:</w:t>
-      </w:r>
-    </w:p>
-    <w:p>
-      <w:pPr>
-        <w:pStyle w:val="ListParagraph"/>
-        <w:numPr>
-          <w:ilvl w:val="0"/>
-          <w:numId w:val="3"/>
-        </w:numPr>
-        <w:tabs>
-          <w:tab w:val="left" w:pos="810"/>
-        </w:tabs>
-        <w:spacing w:before="224" w:line="192" w:lineRule="auto"/>
-        <w:ind w:left="809" w:hanging="361"/>
-        <w:rPr>
-          <w:sz w:val="24"/>
-          <w:szCs w:val="24"/>
-        </w:rPr>
-      </w:pPr>
-      <w:r>
-        <w:rPr>
-          <w:sz w:val="24"/>
-          <w:szCs w:val="24"/>
-        </w:rPr>
-        <w:t xml:space="preserve">Solved </w:t>
-      </w:r>
-      <w:r>
-        <w:rPr>
-          <w:b/>
-          <w:bCs/>
-          <w:sz w:val="24"/>
-          <w:szCs w:val="24"/>
-        </w:rPr>
-        <w:t>300+ DSA problems</w:t>
-      </w:r>
-      <w:r>
-        <w:rPr>
-          <w:sz w:val="24"/>
-          <w:szCs w:val="24"/>
-        </w:rPr>
-        <w:t xml:space="preserve"> across </w:t>
-      </w:r>
-      <w:proofErr w:type="spellStart"/>
-      <w:r>
-        <w:rPr>
-          <w:sz w:val="24"/>
-          <w:szCs w:val="24"/>
-        </w:rPr>
-        <w:t>LeetCode</w:t>
-      </w:r>
-      <w:proofErr w:type="spellEnd"/>
-      <w:r>
-        <w:rPr>
-          <w:sz w:val="24"/>
-          <w:szCs w:val="24"/>
-        </w:rPr>
-        <w:t xml:space="preserve">, </w:t>
-      </w:r>
-      <w:proofErr w:type="spellStart"/>
-      <w:r>
-        <w:rPr>
-          <w:sz w:val="24"/>
-          <w:szCs w:val="24"/>
-        </w:rPr>
-        <w:t>Codeforces</w:t>
-      </w:r>
-      <w:proofErr w:type="spellEnd"/>
-      <w:r>
-        <w:rPr>
-          <w:sz w:val="24"/>
-          <w:szCs w:val="24"/>
-        </w:rPr>
-        <w:t xml:space="preserve">, and </w:t>
-      </w:r>
-      <w:proofErr w:type="spellStart"/>
-      <w:r>
-        <w:rPr>
-          <w:sz w:val="24"/>
-          <w:szCs w:val="24"/>
-        </w:rPr>
-        <w:t>SmartInterviews</w:t>
-      </w:r>
-      <w:proofErr w:type="spellEnd"/>
-      <w:r>
-        <w:rPr>
-          <w:sz w:val="24"/>
-          <w:szCs w:val="24"/>
-        </w:rPr>
-        <w:t>.</w:t>
       </w:r>
     </w:p>
     <w:p>
@@ -2675,13 +2672,27 @@
           <w:sz w:val="24"/>
           <w:szCs w:val="24"/>
         </w:rPr>
-        <w:t xml:space="preserve">Active participant in </w:t>
+        <w:t xml:space="preserve">Solved </w:t>
+      </w:r>
+      <w:r>
+        <w:rPr>
+          <w:b/>
+          <w:bCs/>
+          <w:sz w:val="24"/>
+          <w:szCs w:val="24"/>
+        </w:rPr>
+        <w:t>500+ DSA problems</w:t>
+      </w:r>
+      <w:r>
+        <w:rPr>
+          <w:sz w:val="24"/>
+          <w:szCs w:val="24"/>
+        </w:rPr>
+        <w:t xml:space="preserve"> across </w:t>
       </w:r>
       <w:proofErr w:type="spellStart"/>
       <w:r>
         <w:rPr>
-          <w:b/>
-          <w:bCs/>
           <w:sz w:val="24"/>
           <w:szCs w:val="24"/>
         </w:rPr>
@@ -2690,18 +2701,14 @@
       <w:proofErr w:type="spellEnd"/>
       <w:r>
         <w:rPr>
-          <w:b/>
-          <w:bCs/>
-          <w:sz w:val="24"/>
-          <w:szCs w:val="24"/>
-        </w:rPr>
-        <w:t xml:space="preserve"> Weekly and </w:t>
+          <w:sz w:val="24"/>
+          <w:szCs w:val="24"/>
+        </w:rPr>
+        <w:t xml:space="preserve">, </w:t>
       </w:r>
       <w:proofErr w:type="spellStart"/>
       <w:r>
         <w:rPr>
-          <w:b/>
-          <w:bCs/>
           <w:sz w:val="24"/>
           <w:szCs w:val="24"/>
         </w:rPr>
@@ -2710,13 +2717,36 @@
       <w:proofErr w:type="spellEnd"/>
       <w:r>
         <w:rPr>
-          <w:b/>
-          <w:bCs/>
-          <w:sz w:val="24"/>
-          <w:szCs w:val="24"/>
-        </w:rPr>
-        <w:t xml:space="preserve"> Rated Contests</w:t>
-      </w:r>
+          <w:sz w:val="24"/>
+          <w:szCs w:val="24"/>
+        </w:rPr>
+        <w:t xml:space="preserve">, </w:t>
+      </w:r>
+      <w:proofErr w:type="spellStart"/>
+      <w:r>
+        <w:rPr>
+          <w:sz w:val="24"/>
+          <w:szCs w:val="24"/>
+        </w:rPr>
+        <w:t>CodeChef</w:t>
+      </w:r>
+      <w:proofErr w:type="spellEnd"/>
+      <w:r>
+        <w:rPr>
+          <w:sz w:val="24"/>
+          <w:szCs w:val="24"/>
+        </w:rPr>
+        <w:t xml:space="preserve">, and </w:t>
+      </w:r>
+      <w:proofErr w:type="spellStart"/>
+      <w:r>
+        <w:rPr>
+          <w:sz w:val="24"/>
+          <w:szCs w:val="24"/>
+        </w:rPr>
+        <w:t>SmartInterviews</w:t>
+      </w:r>
+      <w:proofErr w:type="spellEnd"/>
       <w:r>
         <w:rPr>
           <w:sz w:val="24"/>
@@ -2748,8 +2778,9 @@
           <w:sz w:val="24"/>
           <w:szCs w:val="24"/>
         </w:rPr>
-        <w:t xml:space="preserve">Completed </w:t>
-      </w:r>
+        <w:t xml:space="preserve">Contest ratings: </w:t>
+      </w:r>
+      <w:proofErr w:type="spellStart"/>
       <w:r>
         <w:rPr>
           <w:b/>
@@ -2757,11 +2788,116 @@
           <w:sz w:val="24"/>
           <w:szCs w:val="24"/>
         </w:rPr>
-        <w:t>MERN Stack Development Industrial Training</w:t>
+        <w:t>LeetCode</w:t>
+      </w:r>
+      <w:proofErr w:type="spellEnd"/>
+      <w:r>
+        <w:rPr>
+          <w:b/>
+          <w:bCs/>
+          <w:sz w:val="24"/>
+          <w:szCs w:val="24"/>
+        </w:rPr>
+        <w:t xml:space="preserve"> 1672</w:t>
+      </w:r>
+      <w:r>
+        <w:rPr>
+          <w:sz w:val="24"/>
+          <w:szCs w:val="24"/>
+        </w:rPr>
+        <w:t xml:space="preserve">, </w:t>
+      </w:r>
+      <w:proofErr w:type="spellStart"/>
+      <w:r>
+        <w:rPr>
+          <w:b/>
+          <w:bCs/>
+          <w:sz w:val="24"/>
+          <w:szCs w:val="24"/>
+        </w:rPr>
+        <w:t>CodeChef</w:t>
+      </w:r>
+      <w:proofErr w:type="spellEnd"/>
+      <w:r>
+        <w:rPr>
+          <w:b/>
+          <w:bCs/>
+          <w:sz w:val="24"/>
+          <w:szCs w:val="24"/>
+        </w:rPr>
+        <w:t xml:space="preserve"> 1414 (2</w:t>
+      </w:r>
+      <w:r>
+        <w:rPr>
+          <w:rFonts w:ascii="Segoe UI Symbol" w:hAnsi="Segoe UI Symbol" w:cs="Segoe UI Symbol"/>
+          <w:b/>
+          <w:bCs/>
+          <w:sz w:val="24"/>
+          <w:szCs w:val="24"/>
+        </w:rPr>
+        <w:t>★</w:t>
+      </w:r>
+      <w:r>
+        <w:rPr>
+          <w:b/>
+          <w:bCs/>
+          <w:sz w:val="24"/>
+          <w:szCs w:val="24"/>
+        </w:rPr>
+        <w:t>)</w:t>
+      </w:r>
+      <w:r>
+        <w:rPr>
+          <w:sz w:val="24"/>
+          <w:szCs w:val="24"/>
+        </w:rPr>
+        <w:t>.</w:t>
       </w:r>
     </w:p>
     <w:p>
       <w:pPr>
+        <w:pStyle w:val="ListParagraph"/>
+        <w:numPr>
+          <w:ilvl w:val="0"/>
+          <w:numId w:val="3"/>
+        </w:numPr>
+        <w:tabs>
+          <w:tab w:val="left" w:pos="810"/>
+        </w:tabs>
+        <w:spacing w:before="42" w:line="192" w:lineRule="auto"/>
+        <w:ind w:left="809" w:hanging="361"/>
+        <w:rPr>
+          <w:b/>
+          <w:sz w:val="24"/>
+          <w:szCs w:val="24"/>
+        </w:rPr>
+      </w:pPr>
+      <w:r>
+        <w:rPr>
+          <w:sz w:val="24"/>
+          <w:szCs w:val="24"/>
+        </w:rPr>
+        <w:t xml:space="preserve">Completed </w:t>
+      </w:r>
+      <w:r>
+        <w:rPr>
+          <w:b/>
+          <w:bCs/>
+          <w:sz w:val="24"/>
+          <w:szCs w:val="24"/>
+        </w:rPr>
+        <w:t>MERN Stack and Agentic AI Industrial Training</w:t>
+      </w:r>
+      <w:r>
+        <w:rPr>
+          <w:sz w:val="24"/>
+          <w:szCs w:val="24"/>
+        </w:rPr>
+        <w:t>.</w:t>
+      </w:r>
+    </w:p>
+    <w:p>
+      <w:pPr>
         <w:pStyle w:val="Heading1"/>
         <w:spacing w:before="157" w:line="192" w:lineRule="auto"/>
         <w:rPr>
@@ -2780,7 +2916,16 @@
           <w:szCs w:val="24"/>
         </w:rPr>
         <w:lastRenderedPageBreak/>
-        <w:t>Co-Curricular:</w:t>
+        <w:t>Activities</w:t>
+      </w:r>
+      <w:r>
+        <w:rPr>
+          <w:rFonts w:ascii="Times New Roman" w:hAnsi="Times New Roman" w:cs="Times New Roman"/>
+          <w:color w:val="auto"/>
+          <w:sz w:val="24"/>
+          <w:szCs w:val="24"/>
+        </w:rPr>
+        <w:t>:</w:t>
       </w:r>
     </w:p>
     <w:p>
@@ -2793,119 +2938,47 @@
         <w:tabs>
           <w:tab w:val="left" w:pos="774"/>
         </w:tabs>
-        <w:spacing w:before="120" w:line="192" w:lineRule="auto"/>
+        <w:spacing w:line="276" w:lineRule="auto"/>
         <w:ind w:hanging="361"/>
-        <w:rPr>
-          <w:b/>
-          <w:sz w:val="24"/>
-          <w:szCs w:val="24"/>
-        </w:rPr>
-      </w:pPr>
-      <w:r>
-        <w:rPr>
-          <w:sz w:val="24"/>
-          <w:szCs w:val="24"/>
-        </w:rPr>
-        <w:t>Won</w:t>
-      </w:r>
-      <w:r>
-        <w:rPr>
-          <w:spacing w:val="-1"/>
-          <w:sz w:val="24"/>
-          <w:szCs w:val="24"/>
-        </w:rPr>
-        <w:t xml:space="preserve"> </w:t>
-      </w:r>
-      <w:r>
-        <w:rPr>
-          <w:b/>
-          <w:sz w:val="24"/>
-          <w:szCs w:val="24"/>
-        </w:rPr>
-        <w:t>2</w:t>
-      </w:r>
-      <w:r>
-        <w:rPr>
-          <w:b/>
-          <w:position w:val="8"/>
-          <w:sz w:val="24"/>
-          <w:szCs w:val="24"/>
-        </w:rPr>
-        <w:t>st</w:t>
-      </w:r>
-      <w:r>
-        <w:rPr>
-          <w:b/>
-          <w:spacing w:val="18"/>
-          <w:position w:val="8"/>
-          <w:sz w:val="24"/>
-          <w:szCs w:val="24"/>
-        </w:rPr>
-        <w:t xml:space="preserve"> </w:t>
-      </w:r>
-      <w:r>
-        <w:rPr>
-          <w:b/>
-          <w:sz w:val="24"/>
-          <w:szCs w:val="24"/>
-        </w:rPr>
-        <w:t>Prize</w:t>
-      </w:r>
-      <w:r>
-        <w:rPr>
-          <w:b/>
-          <w:spacing w:val="-2"/>
-          <w:sz w:val="24"/>
-          <w:szCs w:val="24"/>
-        </w:rPr>
-        <w:t xml:space="preserve"> </w:t>
-      </w:r>
-      <w:r>
-        <w:rPr>
-          <w:sz w:val="24"/>
-          <w:szCs w:val="24"/>
-        </w:rPr>
-        <w:t>in</w:t>
-      </w:r>
-      <w:r>
-        <w:rPr>
-          <w:spacing w:val="-1"/>
-          <w:sz w:val="24"/>
-          <w:szCs w:val="24"/>
-        </w:rPr>
-        <w:t xml:space="preserve"> </w:t>
-      </w:r>
-      <w:r>
-        <w:rPr>
-          <w:spacing w:val="-1"/>
-          <w:sz w:val="24"/>
-          <w:szCs w:val="24"/>
-        </w:rPr>
-        <w:t>the wolf of the wall street event</w:t>
-      </w:r>
-      <w:r>
-        <w:rPr>
+      </w:pPr>
+      <w:r>
+        <w:rPr>
+          <w:sz w:val="24"/>
+          <w:szCs w:val="24"/>
+        </w:rPr>
+        <w:t xml:space="preserve">Active member of </w:t>
+      </w:r>
+      <w:r>
+        <w:rPr>
+          <w:b/>
           <w:bCs/>
-          <w:spacing w:val="1"/>
-          <w:sz w:val="24"/>
-          <w:szCs w:val="24"/>
-        </w:rPr>
-        <w:t xml:space="preserve"> </w:t>
-      </w:r>
-      <w:r>
-        <w:rPr>
-          <w:sz w:val="24"/>
-          <w:szCs w:val="24"/>
-        </w:rPr>
-        <w:t>conducted by CSI</w:t>
-      </w:r>
-      <w:r>
-        <w:rPr>
+          <w:sz w:val="24"/>
+          <w:szCs w:val="24"/>
+        </w:rPr>
+        <w:t>CSI</w:t>
+      </w:r>
+      <w:r>
+        <w:rPr>
+          <w:sz w:val="24"/>
+          <w:szCs w:val="24"/>
+        </w:rPr>
+        <w:t xml:space="preserve">, VNR VJIET. Won </w:t>
+      </w:r>
+      <w:r>
+        <w:rPr>
+          <w:b/>
           <w:bCs/>
           <w:sz w:val="24"/>
           <w:szCs w:val="24"/>
         </w:rPr>
-        <w:t>.</w:t>
+        <w:t>2nd Prize</w:t>
+      </w:r>
+      <w:r>
+        <w:rPr>
+          <w:sz w:val="24"/>
+          <w:szCs w:val="24"/>
+        </w:rPr>
+        <w:t xml:space="preserve"> in Wolf of the Wall Street.</w:t>
       </w:r>
     </w:p>
     <w:p>
@@ -2918,38 +2991,20 @@
         <w:tabs>
           <w:tab w:val="left" w:pos="774"/>
         </w:tabs>
-        <w:spacing w:line="192" w:lineRule="auto"/>
+        <w:spacing w:line="276" w:lineRule="auto"/>
         <w:ind w:hanging="361"/>
-      </w:pPr>
-      <w:r>
-        <w:rPr>
-          <w:sz w:val="24"/>
-          <w:szCs w:val="24"/>
-        </w:rPr>
-        <w:t>Participated</w:t>
-      </w:r>
-      <w:r>
-        <w:rPr>
-          <w:spacing w:val="30"/>
-          <w:sz w:val="24"/>
-          <w:szCs w:val="24"/>
-        </w:rPr>
-        <w:t xml:space="preserve"> </w:t>
-      </w:r>
-      <w:r>
-        <w:rPr>
-          <w:sz w:val="24"/>
-          <w:szCs w:val="24"/>
-        </w:rPr>
-        <w:t>in</w:t>
-      </w:r>
-      <w:r>
-        <w:rPr>
-          <w:spacing w:val="89"/>
-          <w:sz w:val="24"/>
-          <w:szCs w:val="24"/>
-        </w:rPr>
-        <w:t xml:space="preserve"> </w:t>
+        <w:rPr>
+          <w:b/>
+          <w:sz w:val="24"/>
+          <w:szCs w:val="24"/>
+        </w:rPr>
+      </w:pPr>
+      <w:r>
+        <w:rPr>
+          <w:sz w:val="24"/>
+          <w:szCs w:val="24"/>
+        </w:rPr>
+        <w:t xml:space="preserve">Participated in </w:t>
       </w:r>
       <w:proofErr w:type="spellStart"/>
       <w:r>
@@ -2967,7 +3022,23 @@
           <w:sz w:val="24"/>
           <w:szCs w:val="24"/>
         </w:rPr>
-        <w:t xml:space="preserve"> event conducted by CSI.</w:t>
+        <w:t xml:space="preserve"> and </w:t>
+      </w:r>
+      <w:r>
+        <w:rPr>
+          <w:b/>
+          <w:bCs/>
+          <w:sz w:val="24"/>
+          <w:szCs w:val="24"/>
+        </w:rPr>
+        <w:t>Build with RAG</w:t>
+      </w:r>
+      <w:r>
+        <w:rPr>
+          <w:sz w:val="24"/>
+          <w:szCs w:val="24"/>
+        </w:rPr>
+        <w:t>, both conducted by CSI.</w:t>
       </w:r>
     </w:p>
     <w:p>
@@ -2980,136 +3051,31 @@
         <w:tabs>
           <w:tab w:val="left" w:pos="774"/>
         </w:tabs>
-        <w:spacing w:line="192" w:lineRule="auto"/>
+        <w:spacing w:before="156" w:line="192" w:lineRule="auto"/>
         <w:ind w:hanging="361"/>
         <w:rPr>
-          <w:b/>
-          <w:sz w:val="24"/>
-          <w:szCs w:val="24"/>
-        </w:rPr>
-      </w:pPr>
-      <w:r>
-        <w:rPr>
-          <w:sz w:val="24"/>
-          <w:szCs w:val="24"/>
-        </w:rPr>
-        <w:t>Participated</w:t>
-      </w:r>
-      <w:r>
-        <w:rPr>
-          <w:spacing w:val="-2"/>
-          <w:sz w:val="24"/>
-          <w:szCs w:val="24"/>
-        </w:rPr>
-        <w:t xml:space="preserve"> </w:t>
-      </w:r>
-      <w:r>
-        <w:rPr>
-          <w:sz w:val="24"/>
-          <w:szCs w:val="24"/>
-        </w:rPr>
-        <w:t xml:space="preserve">in </w:t>
-      </w:r>
-      <w:r>
-        <w:rPr>
-          <w:b/>
-          <w:sz w:val="24"/>
-          <w:szCs w:val="24"/>
-        </w:rPr>
-        <w:t>Build with RAG</w:t>
-      </w:r>
-      <w:r>
-        <w:rPr>
-          <w:b/>
-          <w:spacing w:val="-1"/>
-          <w:sz w:val="24"/>
-          <w:szCs w:val="24"/>
-        </w:rPr>
-        <w:t xml:space="preserve"> </w:t>
-      </w:r>
-      <w:r>
-        <w:rPr>
-          <w:sz w:val="24"/>
-          <w:szCs w:val="24"/>
-        </w:rPr>
-        <w:t>conducted</w:t>
-      </w:r>
-      <w:r>
-        <w:rPr>
-          <w:spacing w:val="-1"/>
-          <w:sz w:val="24"/>
-          <w:szCs w:val="24"/>
-        </w:rPr>
-        <w:t xml:space="preserve"> </w:t>
-      </w:r>
-      <w:r>
-        <w:rPr>
-          <w:sz w:val="24"/>
-          <w:szCs w:val="24"/>
-        </w:rPr>
-        <w:t>by</w:t>
-      </w:r>
-      <w:r>
-        <w:rPr>
-          <w:spacing w:val="-1"/>
-          <w:sz w:val="24"/>
-          <w:szCs w:val="24"/>
-        </w:rPr>
-        <w:t xml:space="preserve"> </w:t>
-      </w:r>
-      <w:r>
-        <w:rPr>
+          <w:sz w:val="24"/>
+          <w:szCs w:val="24"/>
+        </w:rPr>
+      </w:pPr>
+      <w:r>
+        <w:rPr>
+          <w:sz w:val="24"/>
+          <w:szCs w:val="24"/>
+        </w:rPr>
+        <w:t xml:space="preserve">Active participant in college-level coding contests by </w:t>
+      </w:r>
+      <w:r>
+        <w:rPr>
+          <w:b/>
           <w:bCs/>
           <w:sz w:val="24"/>
           <w:szCs w:val="24"/>
         </w:rPr>
-        <w:t>CSI</w:t>
-      </w:r>
-      <w:r>
-        <w:rPr>
-          <w:bCs/>
-          <w:spacing w:val="-1"/>
-          <w:sz w:val="24"/>
-          <w:szCs w:val="24"/>
-        </w:rPr>
-        <w:t xml:space="preserve"> </w:t>
-      </w:r>
-      <w:r>
-        <w:rPr>
-          <w:bCs/>
-          <w:sz w:val="24"/>
-          <w:szCs w:val="24"/>
-        </w:rPr>
-        <w:t>in</w:t>
-      </w:r>
-      <w:r>
-        <w:rPr>
-          <w:bCs/>
-          <w:spacing w:val="-2"/>
-          <w:sz w:val="24"/>
-          <w:szCs w:val="24"/>
-        </w:rPr>
-        <w:t xml:space="preserve"> </w:t>
-      </w:r>
-      <w:r>
-        <w:rPr>
-          <w:bCs/>
-          <w:sz w:val="24"/>
-          <w:szCs w:val="24"/>
-        </w:rPr>
-        <w:t>V</w:t>
-      </w:r>
-      <w:r>
-        <w:rPr>
-          <w:bCs/>
-          <w:sz w:val="24"/>
-          <w:szCs w:val="24"/>
-        </w:rPr>
-        <w:t>NR VJIET</w:t>
-      </w:r>
-      <w:r>
-        <w:rPr>
-          <w:bCs/>
+        <w:t>Turing Hut</w:t>
+      </w:r>
+      <w:r>
+        <w:rPr>
           <w:sz w:val="24"/>
           <w:szCs w:val="24"/>
         </w:rPr>
@@ -3118,227 +3084,23 @@
     </w:p>
     <w:p>
       <w:pPr>
-        <w:pStyle w:val="Heading1"/>
+        <w:tabs>
+          <w:tab w:val="left" w:pos="774"/>
+        </w:tabs>
         <w:spacing w:before="156" w:line="192" w:lineRule="auto"/>
-        <w:rPr>
-          <w:rFonts w:ascii="Times New Roman" w:hAnsi="Times New Roman" w:cs="Times New Roman"/>
-          <w:color w:val="auto"/>
-          <w:sz w:val="24"/>
-          <w:szCs w:val="24"/>
-        </w:rPr>
-      </w:pPr>
-      <w:r>
-        <w:rPr>
-          <w:rFonts w:ascii="Times New Roman" w:hAnsi="Times New Roman" w:cs="Times New Roman"/>
-          <w:color w:val="auto"/>
-          <w:sz w:val="24"/>
-          <w:szCs w:val="24"/>
-        </w:rPr>
-        <w:t>Extra-Curricular:</w:t>
-      </w:r>
-    </w:p>
-    <w:p>
-      <w:pPr>
-        <w:pStyle w:val="ListParagraph"/>
-        <w:numPr>
-          <w:ilvl w:val="0"/>
-          <w:numId w:val="4"/>
-        </w:numPr>
-        <w:tabs>
-          <w:tab w:val="left" w:pos="736"/>
-        </w:tabs>
-        <w:spacing w:before="220" w:line="192" w:lineRule="auto"/>
-        <w:ind w:left="735" w:hanging="361"/>
-        <w:rPr>
-          <w:b/>
-          <w:sz w:val="24"/>
-          <w:szCs w:val="24"/>
-        </w:rPr>
-      </w:pPr>
-      <w:r>
-        <w:rPr>
-          <w:sz w:val="24"/>
-          <w:szCs w:val="24"/>
-        </w:rPr>
-        <w:t>Played</w:t>
-      </w:r>
-      <w:r>
-        <w:rPr>
-          <w:spacing w:val="-1"/>
-          <w:sz w:val="24"/>
-          <w:szCs w:val="24"/>
-        </w:rPr>
-        <w:t xml:space="preserve"> </w:t>
-      </w:r>
-      <w:proofErr w:type="spellStart"/>
-      <w:r>
-        <w:rPr>
-          <w:sz w:val="24"/>
-          <w:szCs w:val="24"/>
-        </w:rPr>
-        <w:t>VolleyBall</w:t>
-      </w:r>
-      <w:proofErr w:type="spellEnd"/>
-      <w:r>
-        <w:rPr>
-          <w:spacing w:val="-1"/>
-          <w:sz w:val="24"/>
-          <w:szCs w:val="24"/>
-        </w:rPr>
-        <w:t xml:space="preserve"> </w:t>
-      </w:r>
-      <w:r>
-        <w:rPr>
-          <w:b/>
-          <w:bCs/>
-          <w:sz w:val="24"/>
-          <w:szCs w:val="24"/>
-        </w:rPr>
-        <w:t>college</w:t>
-      </w:r>
-      <w:r>
-        <w:rPr>
-          <w:b/>
-          <w:bCs/>
-          <w:spacing w:val="-2"/>
-          <w:sz w:val="24"/>
-          <w:szCs w:val="24"/>
-        </w:rPr>
-        <w:t xml:space="preserve"> </w:t>
-      </w:r>
-      <w:r>
-        <w:rPr>
-          <w:b/>
-          <w:bCs/>
-          <w:sz w:val="24"/>
-          <w:szCs w:val="24"/>
-        </w:rPr>
-        <w:t>level</w:t>
-      </w:r>
-      <w:r>
-        <w:rPr>
-          <w:spacing w:val="-1"/>
-          <w:sz w:val="24"/>
-          <w:szCs w:val="24"/>
-        </w:rPr>
-        <w:t xml:space="preserve"> </w:t>
-      </w:r>
-      <w:r>
-        <w:rPr>
-          <w:sz w:val="24"/>
-          <w:szCs w:val="24"/>
-        </w:rPr>
-        <w:t>sports</w:t>
-      </w:r>
-      <w:r>
-        <w:rPr>
-          <w:sz w:val="24"/>
-          <w:szCs w:val="24"/>
-        </w:rPr>
-        <w:t xml:space="preserve"> in VNRVJIET</w:t>
-      </w:r>
-      <w:r>
-        <w:rPr>
-          <w:b/>
-          <w:sz w:val="24"/>
-          <w:szCs w:val="24"/>
-        </w:rPr>
-        <w:t>.</w:t>
-      </w:r>
-    </w:p>
-    <w:p>
-      <w:pPr>
-        <w:pStyle w:val="ListParagraph"/>
-        <w:numPr>
-          <w:ilvl w:val="0"/>
-          <w:numId w:val="4"/>
-        </w:numPr>
-        <w:tabs>
-          <w:tab w:val="left" w:pos="736"/>
-        </w:tabs>
-        <w:spacing w:before="42" w:line="192" w:lineRule="auto"/>
-        <w:ind w:left="735" w:hanging="361"/>
-        <w:rPr>
-          <w:sz w:val="24"/>
-          <w:szCs w:val="24"/>
-        </w:rPr>
-      </w:pPr>
-      <w:r>
-        <w:rPr>
-          <w:sz w:val="24"/>
-          <w:szCs w:val="24"/>
-        </w:rPr>
-        <w:t>Active participation in college level coding contests conducted by Turing hut</w:t>
-      </w:r>
-      <w:r>
-        <w:rPr>
-          <w:sz w:val="24"/>
-          <w:szCs w:val="24"/>
-        </w:rPr>
-        <w:t>.</w:t>
-      </w:r>
-    </w:p>
-    <w:p>
-      <w:pPr>
-        <w:pStyle w:val="ListParagraph"/>
-        <w:numPr>
-          <w:ilvl w:val="0"/>
-          <w:numId w:val="4"/>
-        </w:numPr>
-        <w:tabs>
-          <w:tab w:val="left" w:pos="736"/>
-        </w:tabs>
-        <w:spacing w:before="42" w:line="192" w:lineRule="auto"/>
-        <w:ind w:left="735" w:hanging="361"/>
-        <w:rPr>
-          <w:sz w:val="24"/>
-          <w:szCs w:val="24"/>
-        </w:rPr>
-      </w:pPr>
-      <w:r>
-        <w:rPr>
-          <w:sz w:val="24"/>
-          <w:szCs w:val="24"/>
-        </w:rPr>
-        <w:t xml:space="preserve">Active member of </w:t>
-      </w:r>
-      <w:r>
-        <w:rPr>
-          <w:b/>
-          <w:bCs/>
-          <w:sz w:val="24"/>
-          <w:szCs w:val="24"/>
-        </w:rPr>
-        <w:t>CSI</w:t>
-      </w:r>
-      <w:r>
-        <w:rPr>
-          <w:sz w:val="24"/>
-          <w:szCs w:val="24"/>
-        </w:rPr>
-        <w:t xml:space="preserve"> VNRVJIET</w:t>
-      </w:r>
-      <w:r>
-        <w:rPr>
-          <w:sz w:val="24"/>
-          <w:szCs w:val="24"/>
-        </w:rPr>
-        <w:t>.</w:t>
-      </w:r>
-    </w:p>
-    <w:p>
-      <w:pPr>
-        <w:pStyle w:val="ListParagraph"/>
-        <w:tabs>
-          <w:tab w:val="left" w:pos="736"/>
-        </w:tabs>
-        <w:spacing w:before="42" w:line="168" w:lineRule="auto"/>
-        <w:ind w:left="735" w:firstLine="0"/>
-        <w:rPr>
-          <w:sz w:val="24"/>
-          <w:szCs w:val="24"/>
-        </w:rPr>
-      </w:pPr>
+        <w:ind w:left="412"/>
+        <w:rPr>
+          <w:sz w:val="24"/>
+          <w:szCs w:val="24"/>
+        </w:rPr>
+      </w:pPr>
+      <w:r>
+        <w:rPr>
+          <w:sz w:val="24"/>
+          <w:szCs w:val="24"/>
+        </w:rPr>
+        <w:tab/>
+      </w:r>
     </w:p>
     <w:tbl>
       <w:tblPr>
@@ -4107,7 +3869,10 @@
               <w:t xml:space="preserve"> </w:t>
             </w:r>
             <w:r>
-              <w:t>5971 2833 1732</w:t>
+              <w:t>5971 2833 17</w:t>
+            </w:r>
+            <w:r>
+              <w:t>32</w:t>
             </w:r>
           </w:p>
         </w:tc>
@@ -4833,31 +4598,31 @@
           <w:sz w:val="24"/>
           <w:szCs w:val="24"/>
         </w:rPr>
-        <w:t>1</w:t>
-      </w:r>
-      <w:r>
-        <w:rPr>
-          <w:rFonts w:ascii="Times New Roman" w:hAnsi="Times New Roman" w:cs="Times New Roman"/>
-          <w:sz w:val="24"/>
-          <w:szCs w:val="24"/>
-        </w:rPr>
-        <w:t>6</w:t>
-      </w:r>
-      <w:r>
-        <w:rPr>
-          <w:rFonts w:ascii="Times New Roman" w:hAnsi="Times New Roman" w:cs="Times New Roman"/>
-          <w:sz w:val="24"/>
-          <w:szCs w:val="24"/>
-        </w:rPr>
-        <w:t>-0</w:t>
-      </w:r>
-      <w:r>
-        <w:rPr>
-          <w:rFonts w:ascii="Times New Roman" w:hAnsi="Times New Roman" w:cs="Times New Roman"/>
-          <w:sz w:val="24"/>
-          <w:szCs w:val="24"/>
-        </w:rPr>
-        <w:t>8-</w:t>
+        <w:t>25</w:t>
+      </w:r>
+      <w:r>
+        <w:rPr>
+          <w:rFonts w:ascii="Times New Roman" w:hAnsi="Times New Roman" w:cs="Times New Roman"/>
+          <w:sz w:val="24"/>
+          <w:szCs w:val="24"/>
+        </w:rPr>
+        <w:t>-</w:t>
+      </w:r>
+      <w:r>
+        <w:rPr>
+          <w:rFonts w:ascii="Times New Roman" w:hAnsi="Times New Roman" w:cs="Times New Roman"/>
+          <w:sz w:val="24"/>
+          <w:szCs w:val="24"/>
+        </w:rPr>
+        <w:t>10</w:t>
+      </w:r>
+      <w:r>
+        <w:rPr>
+          <w:rFonts w:ascii="Times New Roman" w:hAnsi="Times New Roman" w:cs="Times New Roman"/>
+          <w:sz w:val="24"/>
+          <w:szCs w:val="24"/>
+        </w:rPr>
+        <w:t>-</w:t>
       </w:r>
       <w:r>
         <w:rPr>
@@ -5001,7 +4766,7 @@
 </file>
 
 <file path=word/numbering.xml><?xml version="1.0" encoding="utf-8"?>
-<w:numbering xmlns:wpc="http://schemas.microsoft.com/office/word/2010/wordprocessingCanvas" xmlns:cx="http://schemas.microsoft.com/office/drawing/2014/chartex" xmlns:cx1="http://schemas.microsoft.com/office/drawing/2015/9/8/chartex" xmlns:cx2="http://schemas.microsoft.com/office/drawing/2015/10/21/chartex" xmlns:cx3="http://schemas.microsoft.com/office/drawing/2016/5/9/chartex" xmlns:cx4="http://schemas.microsoft.com/office/drawing/2016/5/10/chartex" xmlns:cx5="http://schemas.microsoft.com/office/drawing/2016/5/11/chartex" xmlns:cx6="http://schemas.microsoft.com/office/drawing/2016/5/12/chartex" xmlns:cx7="http://schemas.microsoft.com/office/drawing/2016/5/13/chartex" xmlns:cx8="http://schemas.microsoft.com/office/drawing/2016/5/14/chartex" xmlns:mc="http://schemas.openxmlformats.org/markup-compatibility/2006" xmlns:aink="http://schemas.microsoft.com/office/drawing/2016/ink" xmlns:am3d="http://schemas.microsoft.com/office/drawing/2017/model3d" xmlns:o="urn:schemas-microsoft-com:office:office" xmlns:oel="http://schemas.microsoft.com/office/2019/extlst" xmlns:r="http://schemas.openxmlformats.org/officeDocument/2006/relationships" xmlns:m="http://schemas.openxmlformats.org/officeDocument/2006/math" xmlns:v="urn:schemas-microsoft-com:vml" xmlns:wp14="http://schemas.microsoft.com/office/word/2010/wordprocessingDrawing" xmlns:wp="http://schemas.openxmlformats.org/drawingml/2006/wordprocessingDrawing" xmlns:w10="urn:schemas-microsoft-com:office:word" xmlns:w="http://schemas.openxmlformats.org/wordprocessingml/2006/main" xmlns:w14="http://schemas.microsoft.com/office/word/2010/wordml" xmlns:w15="http://schemas.microsoft.com/office/word/2012/wordml" xmlns:w16cei="http://schemas.microsoft.com/office/word/2026/wordml/cei" xmlns:w16cex="http://schemas.microsoft.com/office/word/2018/wordml/cex" xmlns:w16cid="http://schemas.microsoft.com/office/word/2016/wordml/cid" xmlns:w16="http://schemas.microsoft.com/office/word/2018/wordml" xmlns:w16du="http://schemas.microsoft.com/office/word/2023/wordml/word16du" xmlns:w16sdtdh="http://schemas.microsoft.com/office/word/2020/wordml/sdtdatahash" xmlns:w16sdtfl="http://schemas.microsoft.com/office/word/2024/wordml/sdtformatlock" xmlns:w16se="http://schemas.microsoft.com/office/word/2015/wordml/symex" xmlns:wpg="http://schemas.microsoft.com/office/word/2010/wordprocessingGroup" xmlns:wpi="http://schemas.microsoft.com/office/word/2010/wordprocessingInk" xmlns:wne="http://schemas.microsoft.com/office/word/2006/wordml" xmlns:wps="http://schemas.microsoft.com/office/word/2010/wordprocessingShape" mc:Ignorable="w14 w15 w16se w16cid w16 w16cex w16sdtdh w16sdtfl w16du wp14">
+<w:numbering xmlns:wpc="http://schemas.microsoft.com/office/word/2010/wordprocessingCanvas" xmlns:cx="http://schemas.microsoft.com/office/drawing/2014/chartex" xmlns:cx1="http://schemas.microsoft.com/office/drawing/2015/9/8/chartex" xmlns:cx2="http://schemas.microsoft.com/office/drawing/2015/10/21/chartex" xmlns:cx3="http://schemas.microsoft.com/office/drawing/2016/5/9/chartex" xmlns:cx4="http://schemas.microsoft.com/office/drawing/2016/5/10/chartex" xmlns:cx5="http://schemas.microsoft.com/office/drawing/2016/5/11/chartex" xmlns:cx6="http://schemas.microsoft.com/office/drawing/2016/5/12/chartex" xmlns:cx7="http://schemas.microsoft.com/office/drawing/2016/5/13/chartex" xmlns:cx8="http://schemas.microsoft.com/office/drawing/2016/5/14/chartex" xmlns:mc="http://schemas.openxmlformats.org/markup-compatibility/2006" xmlns:aink="http://schemas.microsoft.com/office/drawing/2016/ink" xmlns:am3d="http://schemas.microsoft.com/office/drawing/2017/model3d" xmlns:o="urn:schemas-microsoft-com:office:office" xmlns:oel="http://schemas.microsoft.com/office/2019/extlst" xmlns:r="http://schemas.openxmlformats.org/officeDocument/2006/relationships" xmlns:m="http://schemas.openxmlformats.org/officeDocument/2006/math" xmlns:v="urn:schemas-microsoft-com:vml" xmlns:wp14="http://schemas.microsoft.com/office/word/2010/wordprocessingDrawing" xmlns:wp="http://schemas.openxmlformats.org/drawingml/2006/wordprocessingDrawing" xmlns:w10="urn:schemas-microsoft-com:office:word" xmlns:w="http://schemas.openxmlformats.org/wordprocessingml/2006/main" xmlns:w14="http://schemas.microsoft.com/office/word/2010/wordml" xmlns:w15="http://schemas.microsoft.com/office/word/2012/wordml" xmlns:w16cex="http://schemas.microsoft.com/office/word/2018/wordml/cex" xmlns:w16cid="http://schemas.microsoft.com/office/word/2016/wordml/cid" xmlns:w16="http://schemas.microsoft.com/office/word/2018/wordml" xmlns:w16du="http://schemas.microsoft.com/office/word/2023/wordml/word16du" xmlns:w16sdtdh="http://schemas.microsoft.com/office/word/2020/wordml/sdtdatahash" xmlns:w16sdtfl="http://schemas.microsoft.com/office/word/2024/wordml/sdtformatlock" xmlns:w16se="http://schemas.microsoft.com/office/word/2015/wordml/symex" xmlns:wpg="http://schemas.microsoft.com/office/word/2010/wordprocessingGroup" xmlns:wpi="http://schemas.microsoft.com/office/word/2010/wordprocessingInk" xmlns:wne="http://schemas.microsoft.com/office/word/2006/wordml" xmlns:wps="http://schemas.microsoft.com/office/word/2010/wordprocessingShape" mc:Ignorable="w14 w15 w16se w16cid w16 w16cex w16sdtdh w16sdtfl w16du wp14">
   <w:abstractNum w:abstractNumId="0" w15:restartNumberingAfterBreak="0">
     <w:nsid w:val="011701E8"/>
     <w:multiLevelType w:val="hybridMultilevel"/>
@@ -5932,7 +5697,6 @@
   <w:style w:type="character" w:default="1" w:styleId="DefaultParagraphFont">
     <w:name w:val="Default Paragraph Font"/>
     <w:uiPriority w:val="1"/>
-    <w:semiHidden/>
     <w:unhideWhenUsed/>
   </w:style>
   <w:style w:type="table" w:default="1" w:styleId="TableNormal">

</xml_diff>